<commit_message>
Collapse pin tools once confirmed; add quick Add Visit button and latest note on cards
Co-authored-by: Copilot <223556219+Copilot@users.noreply.github.com>
</commit_message>
<xml_diff>
--- a/docs/Return Visits & Contacts App Specification (V6).docx
+++ b/docs/Return Visits & Contacts App Specification (V6).docx
@@ -181,7 +181,7 @@
     <w:p>
       <w:pPr/>
       <w:r>
-        <w:t>The main view is the contact list. Cards show contact name, optional email and phone, address/location, elapsed days and urgency, visit history, quick-add note input, and edit, export, print, share, navigate, and delete actions. Navigate opens Google Maps directions using saved coordinates when available, or the contact address otherwise. Share prepares a plain-text summary of available contact details and a directions link for Text / SMS, WhatsApp, or Email; it excludes visit notes and is not encrypted by the app. The contact edit modal provides a Print action for saved, unchanged records.</w:t>
+        <w:t>The main view is the contact list. Cards show contact name, optional email and phone, address/location, elapsed days and urgency, last visit and newest note text, a quick Add Visit button (date/time and optional note in a dialog; earlier visits remain in the edit modal's log), and edit, export, print, share, navigate, and delete actions. Navigate opens Google Maps directions using saved coordinates when available, or the contact address otherwise. Share prepares a plain-text summary of available contact details and a directions link for Text / SMS, WhatsApp, or Email; it excludes visit notes and is not encrypted by the app. The contact edit modal provides a Print action for saved, unchanged records.</w:t>
       </w:r>
     </w:p>
     <w:p>
@@ -222,7 +222,7 @@
         <w:t>Coordinates are optional. The user can explicitly choose Use Device Location to request high-accuracy GPS with no cached location, or Find Address or City Pin to search the entered street address, city, and state. A partial street search can return multiple matches for the user to choose; selection fills the full street name and places a pin. If the full address is not found, the app also searches the street name without its leading house number. A city-only search places an approximate city pin. If a full address cannot be found, the app searches the selected city and state and centers the map near that location. The user can search for a nearby cross-street or intersection, or set/refine a location by tapping the contact form map, dragging the pin, or editing coordinates. Pins can be dragged on the Map view and saved automatically. Contacts saved without coordinates have no map pin. Whenever the Map is open with no visible contact pins, it centers approximately on the default city and state, which are sent to Nominatim for the lookup. Address text is sent to OpenStreetMap Nominatim only after the user initiates a search.</w:t>
       </w:r>
       <w:r>
-        <w:t xml:space="preserve"> Street suffixes are displayed in abbreviated form throughout the app, including for previously saved contacts (for example, Avenue as Av, Road as Rd, Court as Ct, and Lane as Ln).</w:t>
+        <w:t xml:space="preserve"> Street suffixes are displayed in abbreviated form throughout the app, including for previously saved contacts (for example, Avenue as Av, Road as Rd, Court as Ct, and Lane as Ln). Once a pin is set, Confirm pin is correct hides the lookup buttons, coordinates and map; they return with Adjust pin or when the street address, city or state changes.</w:t>
       </w:r>
     </w:p>
     <w:p>

</xml_diff>